<commit_message>
Update publication dates and revise discussion questions across multiple case studies for clarity and relevance. Adjusted dates from May 22 and May 25 to May 26, 2026. Enhanced discussion prompts to encourage deeper engagement and critical thinking, focusing on real-world applications and ethical considerations in computing.
</commit_message>
<xml_diff>
--- a/docs/v2/cases/cs01_lovelace_turing.docx
+++ b/docs/v2/cases/cs01_lovelace_turing.docx
@@ -31,7 +31,7 @@
         <w:pStyle w:val="Date"/>
       </w:pPr>
       <w:r>
-        <w:t xml:space="preserve">2026-05-22</w:t>
+        <w:t xml:space="preserve">2026-05-26</w:t>
       </w:r>
     </w:p>
     <w:p>
@@ -2185,100 +2185,35 @@
         </w:numPr>
       </w:pPr>
       <w:r>
-        <w:t xml:space="preserve">Follow the factorial procedure by hand for</w:t>
-      </w:r>
-      <w:r>
-        <w:t xml:space="preserve"> </w:t>
-      </w:r>
-      <m:oMath>
-        <m:r>
-          <m:t>n</m:t>
-        </m:r>
-        <m:r>
-          <m:rPr>
-            <m:sty m:val="p"/>
-          </m:rPr>
-          <m:t>=</m:t>
-        </m:r>
-        <m:r>
-          <m:t>6</m:t>
-        </m:r>
-      </m:oMath>
-      <w:r>
-        <w:t xml:space="preserve">. Then change one line so it computes</w:t>
-      </w:r>
-      <w:r>
-        <w:t xml:space="preserve"> </w:t>
-      </w:r>
-      <m:oMath>
-        <m:r>
-          <m:t>1</m:t>
-        </m:r>
-        <m:r>
-          <m:rPr>
-            <m:sty m:val="p"/>
-          </m:rPr>
-          <m:t>+</m:t>
-        </m:r>
-        <m:r>
-          <m:t>2</m:t>
-        </m:r>
-        <m:r>
-          <m:rPr>
-            <m:sty m:val="p"/>
-          </m:rPr>
-          <m:t>+</m:t>
-        </m:r>
-        <m:r>
-          <m:t>3</m:t>
-        </m:r>
-        <m:r>
-          <m:rPr>
-            <m:sty m:val="p"/>
-          </m:rPr>
-          <m:t>+</m:t>
-        </m:r>
-        <m:r>
-          <m:rPr>
-            <m:sty m:val="p"/>
-          </m:rPr>
-          <m:t>…</m:t>
-        </m:r>
-        <m:r>
-          <m:rPr>
-            <m:sty m:val="p"/>
-          </m:rPr>
-          <m:t>+</m:t>
-        </m:r>
-        <m:r>
-          <m:t>n</m:t>
-        </m:r>
-      </m:oMath>
-      <w:r>
-        <w:t xml:space="preserve"> </w:t>
-      </w:r>
-      <w:r>
-        <w:t xml:space="preserve">instead. What is the new line? What is the new output for</w:t>
-      </w:r>
-      <w:r>
-        <w:t xml:space="preserve"> </w:t>
-      </w:r>
-      <m:oMath>
-        <m:r>
-          <m:t>n</m:t>
-        </m:r>
-        <m:r>
-          <m:rPr>
-            <m:sty m:val="p"/>
-          </m:rPr>
-          <m:t>=</m:t>
-        </m:r>
-        <m:r>
-          <m:t>6</m:t>
-        </m:r>
-      </m:oMath>
-      <w:r>
-        <w:t xml:space="preserve">?</w:t>
+        <w:t xml:space="preserve">Lovelace insisted that</w:t>
+      </w:r>
+      <w:r>
+        <w:t xml:space="preserve"> </w:t>
+      </w:r>
+      <w:r>
+        <w:rPr>
+          <w:i/>
+          <w:iCs/>
+        </w:rPr>
+        <w:t xml:space="preserve">designing</w:t>
+      </w:r>
+      <w:r>
+        <w:t xml:space="preserve"> </w:t>
+      </w:r>
+      <w:r>
+        <w:t xml:space="preserve">a procedure was the original work and that the machine’s execution was only the carrying-out. Use an example from outside computing — a recipe being cooked, a piece of music being performed, an athlete following a coach’s plan — to argue for or against her view. Where in your example does the</w:t>
+      </w:r>
+      <w:r>
+        <w:t xml:space="preserve"> </w:t>
+      </w:r>
+      <w:r>
+        <w:t xml:space="preserve">“originating”</w:t>
+      </w:r>
+      <w:r>
+        <w:t xml:space="preserve"> </w:t>
+      </w:r>
+      <w:r>
+        <w:t xml:space="preserve">actually happen?</w:t>
       </w:r>
     </w:p>
     <w:p>
@@ -2290,46 +2225,7 @@
         </w:numPr>
       </w:pPr>
       <w:r>
-        <w:t xml:space="preserve">The interpreter only knows</w:t>
-      </w:r>
-      <w:r>
-        <w:t xml:space="preserve"> </w:t>
-      </w:r>
-      <w:r>
-        <w:rPr>
-          <w:rStyle w:val="VerbatimChar"/>
-        </w:rPr>
-        <w:t xml:space="preserve">+</w:t>
-      </w:r>
-      <w:r>
-        <w:t xml:space="preserve">,</w:t>
-      </w:r>
-      <w:r>
-        <w:t xml:space="preserve"> </w:t>
-      </w:r>
-      <w:r>
-        <w:rPr>
-          <w:rStyle w:val="VerbatimChar"/>
-        </w:rPr>
-        <w:t xml:space="preserve">*</w:t>
-      </w:r>
-      <w:r>
-        <w:t xml:space="preserve">, and numbers. Extend the pseudocode so it also handles</w:t>
-      </w:r>
-      <w:r>
-        <w:t xml:space="preserve"> </w:t>
-      </w:r>
-      <w:r>
-        <w:rPr>
-          <w:rStyle w:val="VerbatimChar"/>
-        </w:rPr>
-        <w:t xml:space="preserve">-</w:t>
-      </w:r>
-      <w:r>
-        <w:t xml:space="preserve"> </w:t>
-      </w:r>
-      <w:r>
-        <w:t xml:space="preserve">(subtract). Write one short program in the new instruction set. What is its output?</w:t>
+        <w:t xml:space="preserve">Lovelace was schooled in mathematics partly to keep her from her father’s temperament, published under her initials, and was barred from the Royal Society her whole life. Turing was prosecuted for his sexuality and may have died by suicide as a result. Pick one of them. Does the institutional and personal context they worked inside change how you should read their technical argument about machines? What would you lose by treating the work as separable from the life?</w:t>
       </w:r>
     </w:p>
     <w:p>

</xml_diff>

<commit_message>
Chapter 6; fix to quarto rendering
</commit_message>
<xml_diff>
--- a/docs/v2/cases/cs01_lovelace_turing.docx
+++ b/docs/v2/cases/cs01_lovelace_turing.docx
@@ -31,7 +31,7 @@
         <w:pStyle w:val="Date"/>
       </w:pPr>
       <w:r>
-        <w:t xml:space="preserve">2026-05-26</w:t>
+        <w:t xml:space="preserve">2026-06-01</w:t>
       </w:r>
     </w:p>
     <w:p>
@@ -435,7 +435,7 @@
         <w:pStyle w:val="BodyText"/>
       </w:pPr>
       <w:r>
-        <w:t xml:space="preserve">Lovelace did her mathematics inside a world that did not formally count her as a scientist. The Royal Society would not admit a woman for another seven decades. She corresponded with De Morgan as a private student. She published her Notes under her initials,</w:t>
+        <w:t xml:space="preserve">Lovelace did her mathematics inside a world that did not formally count her as a scientist. The Royal Society would not admit a woman for the better part of a century. She corresponded with De Morgan as a private student. She published her Notes under her initials,</w:t>
       </w:r>
       <w:r>
         <w:t xml:space="preserve"> </w:t>

</xml_diff>

<commit_message>
Add missing front matter to Notebooks 9-12; rebuild the site
Notebooks 1-8 each open with a raw cell carrying title/subtitle/author/date;
Notebooks 9-12 did not, so Quarto fell back to the filename and the published
pages were titled "comp1150_nb09_databases", "comp1150_nb10_osnetworksweb",
and so on. Added the same front-matter cell to all four, with titles matching
the course index and syllabus.

Also refreshed the Colab headers (Notebook 10's had been rewritten by Colab
and Notebook 12's by the previous commit) and re-rendered the whole site, which
was a build behind Notebook 10 and did not yet include any of the content
corrections from the previous commit.

Co-Authored-By: Claude Opus 5 <noreply@anthropic.com>
Claude-Session: https://claude.ai/code/session_01LT8YMU2uVhskatw3vwuRZZ
</commit_message>
<xml_diff>
--- a/docs/v2/cases/cs01_lovelace_turing.docx
+++ b/docs/v2/cases/cs01_lovelace_turing.docx
@@ -31,7 +31,7 @@
         <w:pStyle w:val="Date"/>
       </w:pPr>
       <w:r>
-        <w:t xml:space="preserve">2026-06-01</w:t>
+        <w:t xml:space="preserve">2026-08-20</w:t>
       </w:r>
     </w:p>
     <w:p>
@@ -455,7 +455,7 @@
         <w:pStyle w:val="BodyText"/>
       </w:pPr>
       <w:r>
-        <w:t xml:space="preserve">When her argument was next picked up — and named — its respondent was Alan Turing. In 1936, still a graduate student, Turing wrote a paper titled</w:t>
+        <w:t xml:space="preserve">When her argument was next picked up — and named — its respondent was Alan Turing. In 1936, a newly elected fellow of King’s College, Cambridge and not yet twenty-four, Turing wrote a paper titled</w:t>
       </w:r>
       <w:r>
         <w:t xml:space="preserve"> </w:t>

</xml_diff>